<commit_message>
Revise commission plan: 20-35% tiers, Named and Approved Accounts model
Tiers now start at 20% and cap at 35% (gates unchanged at $250K/$500K/$750K).
Commissionability flipped to approval-based: reps request accounts in
writing, MMG approves/denies/scopes at its discretion; everything else is
non-commissionable by default (no House Account designation burden on MMG).

Co-Authored-By: Claude Fable 5 <noreply@anthropic.com>
Claude-Session: https://claude.ai/code/session_019EoJuzBaRKmij9AN1LjC6F
</commit_message>
<xml_diff>
--- a/docs/mmg/sales-compensation/MMG - Sales Commission Agreement - v1.docx
+++ b/docs/mmg/sales-compensation/MMG - Sales Commission Agreement - v1.docx
@@ -595,16 +595,16 @@
           <w:sz w:val="21"/>
           <w:szCs w:val="21"/>
         </w:rPr>
-        <w:t xml:space="preserve">“Named Account” </w:t>
-      </w:r>
-      <w:r>
-        <w:rPr>
-          <w:rFonts w:ascii="Open Sans" w:cs="Open Sans" w:eastAsia="Open Sans" w:hAnsi="Open Sans"/>
-          <w:color w:val="1D1D1B"/>
-          <w:sz w:val="21"/>
-          <w:szCs w:val="21"/>
-        </w:rPr>
-        <w:t xml:space="preserve">means a customer account expressly assigned to the Sales Representative in writing by MMG (listed in Exhibit B, as amended by MMG in writing from time to time). Commissions under Section 4 are earned </w:t>
+        <w:t xml:space="preserve">“Named and Approved Account” </w:t>
+      </w:r>
+      <w:r>
+        <w:rPr>
+          <w:rFonts w:ascii="Open Sans" w:cs="Open Sans" w:eastAsia="Open Sans" w:hAnsi="Open Sans"/>
+          <w:color w:val="1D1D1B"/>
+          <w:sz w:val="21"/>
+          <w:szCs w:val="21"/>
+        </w:rPr>
+        <w:t xml:space="preserve">means a customer account — or a defined portion of a customer account, such as a specific division, business unit, buying group, or opportunity — that the Sales Representative has requested in writing and that MMG has expressly approved in writing as commissionable for that Sales Representative (recorded in Exhibit B). MMG may grant, deny, scope, condition, or prospectively revoke any such approval in its sole discretion. Approval of a portion of an account does not make any other portion of that account commissionable. Commissions under Section 4 are earned </w:t>
       </w:r>
       <w:r>
         <w:rPr>
@@ -624,7 +624,7 @@
           <w:sz w:val="21"/>
           <w:szCs w:val="21"/>
         </w:rPr>
-        <w:t xml:space="preserve"> on Named Account engagements.</w:t>
+        <w:t xml:space="preserve"> on Named and Approved Account engagements.</w:t>
       </w:r>
     </w:p>
     <w:p>
@@ -645,16 +645,16 @@
           <w:sz w:val="21"/>
           <w:szCs w:val="21"/>
         </w:rPr>
-        <w:t xml:space="preserve">“House Account” / “Other Sales Account” </w:t>
-      </w:r>
-      <w:r>
-        <w:rPr>
-          <w:rFonts w:ascii="Open Sans" w:cs="Open Sans" w:eastAsia="Open Sans" w:hAnsi="Open Sans"/>
-          <w:color w:val="1D1D1B"/>
-          <w:sz w:val="21"/>
-          <w:szCs w:val="21"/>
-        </w:rPr>
-        <w:t xml:space="preserve">means every account that is not a Named Account of the Sales Representative, including accounts MMG designates as house accounts and accounts assigned to other representatives. No commission is payable on House Accounts or Other Sales Accounts unless set out in a separate written schedule signed by both Parties.</w:t>
+        <w:t xml:space="preserve">Default — no commission without approval. </w:t>
+      </w:r>
+      <w:r>
+        <w:rPr>
+          <w:rFonts w:ascii="Open Sans" w:cs="Open Sans" w:eastAsia="Open Sans" w:hAnsi="Open Sans"/>
+          <w:color w:val="1D1D1B"/>
+          <w:sz w:val="21"/>
+          <w:szCs w:val="21"/>
+        </w:rPr>
+        <w:t xml:space="preserve">Every account, and every portion of an account, that is not a Named and Approved Account of the Sales Representative is non-commissionable. No designation, writing, or other action by MMG is required to make or keep an account non-commissionable.</w:t>
       </w:r>
     </w:p>
     <w:p>
@@ -714,7 +714,7 @@
           <w:sz w:val="21"/>
           <w:szCs w:val="21"/>
         </w:rPr>
-        <w:t xml:space="preserve">means the running total of Approved Contract Value of the Sales Representative's Named Account engagements approved during the Plan Year, measured in the order the Approved Pricing Worksheets are approved.</w:t>
+        <w:t xml:space="preserve">means the running total of Approved Contract Value of the Sales Representative's Named and Approved Account engagements approved during the Plan Year, measured in the order the Approved Pricing Worksheets are approved.</w:t>
       </w:r>
     </w:p>
     <w:p>
@@ -1079,7 +1079,7 @@
           <w:sz w:val="26"/>
           <w:szCs w:val="26"/>
         </w:rPr>
-        <w:t xml:space="preserve">4. Commission Plan — Named Accounts</w:t>
+        <w:t xml:space="preserve">4. Commission Plan — Named and Approved Accounts</w:t>
       </w:r>
     </w:p>
     <w:p>
@@ -1100,16 +1100,16 @@
           <w:sz w:val="21"/>
           <w:szCs w:val="21"/>
         </w:rPr>
-        <w:t xml:space="preserve">Scope. </w:t>
-      </w:r>
-      <w:r>
-        <w:rPr>
-          <w:rFonts w:ascii="Open Sans" w:cs="Open Sans" w:eastAsia="Open Sans" w:hAnsi="Open Sans"/>
-          <w:color w:val="1D1D1B"/>
-          <w:sz w:val="21"/>
-          <w:szCs w:val="21"/>
-        </w:rPr>
-        <w:t xml:space="preserve">Commissions are earned only on Named Account engagements sold by the Sales Representative and accepted by MMG. House Accounts and Other Sales Accounts carry no commission unless separately agreed in writing.</w:t>
+        <w:t xml:space="preserve">Scope — approval required. </w:t>
+      </w:r>
+      <w:r>
+        <w:rPr>
+          <w:rFonts w:ascii="Open Sans" w:cs="Open Sans" w:eastAsia="Open Sans" w:hAnsi="Open Sans"/>
+          <w:color w:val="1D1D1B"/>
+          <w:sz w:val="21"/>
+          <w:szCs w:val="21"/>
+        </w:rPr>
+        <w:t xml:space="preserve">Commissions are earned only on Named and Approved Account engagements sold by the Sales Representative and accepted by MMG. The Sales Representative must request account approval in writing before pursuing commissionable business; MMG may approve, deny, or scope the request (including limiting approval to a specific division, business unit, buying group, or opportunity within a larger account) in its sole discretion. All other business is non-commissionable by default.</w:t>
       </w:r>
     </w:p>
     <w:p>
@@ -1139,7 +1139,7 @@
           <w:sz w:val="21"/>
           <w:szCs w:val="21"/>
         </w:rPr>
-        <w:t xml:space="preserve">The Commission Rate steps up as Cumulative Named-Account Revenue grows during the Plan Year, per the table below. Rates are incremental (marginal): each rate applies only to the Gross Profit (CGP) attributable to revenue falling within that band — crossing a threshold does not retroactively change the rate on earlier revenue. If a single engagement spans a threshold, its CGP is apportioned pro-rata between the bands.</w:t>
+        <w:t xml:space="preserve">The Commission Rate starts at 20% and is capped at 35%. It steps up as Cumulative Named-Account Revenue grows during the Plan Year, per the table below. Rates are incremental (marginal): each rate applies only to the Gross Profit (CGP) attributable to revenue falling within that band — crossing a threshold does not retroactively change the rate on earlier revenue. If a single engagement spans a threshold, its CGP is apportioned pro-rata between the bands.</w:t>
       </w:r>
     </w:p>
     <w:p>
@@ -1397,7 +1397,7 @@
                 <w:sz w:val="20"/>
                 <w:szCs w:val="20"/>
               </w:rPr>
-              <w:t xml:space="preserve">15%</w:t>
+              <w:t xml:space="preserve">20%</w:t>
             </w:r>
           </w:p>
         </w:tc>
@@ -1471,7 +1471,7 @@
                 <w:sz w:val="20"/>
                 <w:szCs w:val="20"/>
               </w:rPr>
-              <w:t xml:space="preserve">20%</w:t>
+              <w:t xml:space="preserve">25%</w:t>
             </w:r>
           </w:p>
         </w:tc>
@@ -1545,7 +1545,7 @@
                 <w:sz w:val="20"/>
                 <w:szCs w:val="20"/>
               </w:rPr>
-              <w:t xml:space="preserve">25%</w:t>
+              <w:t xml:space="preserve">30%</w:t>
             </w:r>
           </w:p>
         </w:tc>
@@ -1554,80 +1554,6 @@
         <w:tc>
           <w:tcPr>
             <w:tcW w:type="dxa" w:w="900"/>
-            <w:tcMar>
-              <w:top w:type="dxa" w:w="80"/>
-              <w:left w:type="dxa" w:w="120"/>
-              <w:bottom w:type="dxa" w:w="80"/>
-              <w:right w:type="dxa" w:w="120"/>
-            </w:tcMar>
-          </w:tcPr>
-          <w:p>
-            <w:r>
-              <w:rPr>
-                <w:rFonts w:ascii="Open Sans" w:cs="Open Sans" w:eastAsia="Open Sans" w:hAnsi="Open Sans"/>
-                <w:b w:val="false"/>
-                <w:bCs w:val="false"/>
-                <w:color w:val="1D1D1B"/>
-                <w:sz w:val="20"/>
-                <w:szCs w:val="20"/>
-              </w:rPr>
-              <w:t xml:space="preserve">4</w:t>
-            </w:r>
-          </w:p>
-        </w:tc>
-        <w:tc>
-          <w:tcPr>
-            <w:tcW w:type="dxa" w:w="5400"/>
-            <w:tcMar>
-              <w:top w:type="dxa" w:w="80"/>
-              <w:left w:type="dxa" w:w="120"/>
-              <w:bottom w:type="dxa" w:w="80"/>
-              <w:right w:type="dxa" w:w="120"/>
-            </w:tcMar>
-          </w:tcPr>
-          <w:p>
-            <w:r>
-              <w:rPr>
-                <w:rFonts w:ascii="Open Sans" w:cs="Open Sans" w:eastAsia="Open Sans" w:hAnsi="Open Sans"/>
-                <w:b w:val="false"/>
-                <w:bCs w:val="false"/>
-                <w:color w:val="1D1D1B"/>
-                <w:sz w:val="20"/>
-                <w:szCs w:val="20"/>
-              </w:rPr>
-              <w:t xml:space="preserve">Over $750,000 up to $1,000,000</w:t>
-            </w:r>
-          </w:p>
-        </w:tc>
-        <w:tc>
-          <w:tcPr>
-            <w:tcW w:type="dxa" w:w="3060"/>
-            <w:tcMar>
-              <w:top w:type="dxa" w:w="80"/>
-              <w:left w:type="dxa" w:w="120"/>
-              <w:bottom w:type="dxa" w:w="80"/>
-              <w:right w:type="dxa" w:w="120"/>
-            </w:tcMar>
-          </w:tcPr>
-          <w:p>
-            <w:r>
-              <w:rPr>
-                <w:rFonts w:ascii="Open Sans" w:cs="Open Sans" w:eastAsia="Open Sans" w:hAnsi="Open Sans"/>
-                <w:b w:val="false"/>
-                <w:bCs w:val="false"/>
-                <w:color w:val="1D1D1B"/>
-                <w:sz w:val="20"/>
-                <w:szCs w:val="20"/>
-              </w:rPr>
-              <w:t xml:space="preserve">30%</w:t>
-            </w:r>
-          </w:p>
-        </w:tc>
-      </w:tr>
-      <w:tr>
-        <w:tc>
-          <w:tcPr>
-            <w:tcW w:type="dxa" w:w="900"/>
             <w:shd w:fill="FFE4EA" w:val="clear"/>
             <w:tcMar>
               <w:top w:type="dxa" w:w="80"/>
@@ -1646,7 +1572,7 @@
                 <w:sz w:val="20"/>
                 <w:szCs w:val="20"/>
               </w:rPr>
-              <w:t xml:space="preserve">5</w:t>
+              <w:t xml:space="preserve">4</w:t>
             </w:r>
           </w:p>
         </w:tc>
@@ -1671,7 +1597,7 @@
                 <w:sz w:val="20"/>
                 <w:szCs w:val="20"/>
               </w:rPr>
-              <w:t xml:space="preserve">Over $1,000,000</w:t>
+              <w:t xml:space="preserve">Over $750,000</w:t>
             </w:r>
           </w:p>
         </w:tc>
@@ -1696,7 +1622,7 @@
                 <w:sz w:val="20"/>
                 <w:szCs w:val="20"/>
               </w:rPr>
-              <w:t xml:space="preserve">35%</w:t>
+              <w:t xml:space="preserve">35% (cap)</w:t>
             </w:r>
           </w:p>
         </w:tc>
@@ -1981,7 +1907,7 @@
                 <w:sz w:val="20"/>
                 <w:szCs w:val="20"/>
               </w:rPr>
-              <w:t xml:space="preserve">15%</w:t>
+              <w:t xml:space="preserve">20%</w:t>
             </w:r>
           </w:p>
         </w:tc>
@@ -2005,7 +1931,7 @@
                 <w:sz w:val="20"/>
                 <w:szCs w:val="20"/>
               </w:rPr>
-              <w:t xml:space="preserve">$16,875</w:t>
+              <w:t xml:space="preserve">$22,500</w:t>
             </w:r>
           </w:p>
         </w:tc>
@@ -2029,7 +1955,7 @@
                 <w:sz w:val="20"/>
                 <w:szCs w:val="20"/>
               </w:rPr>
-              <w:t xml:space="preserve">$16,875</w:t>
+              <w:t xml:space="preserve">$22,500</w:t>
             </w:r>
           </w:p>
         </w:tc>
@@ -2127,7 +2053,7 @@
                 <w:sz w:val="20"/>
                 <w:szCs w:val="20"/>
               </w:rPr>
-              <w:t xml:space="preserve">20%</w:t>
+              <w:t xml:space="preserve">25%</w:t>
             </w:r>
           </w:p>
         </w:tc>
@@ -2151,7 +2077,7 @@
                 <w:sz w:val="20"/>
                 <w:szCs w:val="20"/>
               </w:rPr>
-              <w:t xml:space="preserve">$22,500</w:t>
+              <w:t xml:space="preserve">$28,125</w:t>
             </w:r>
           </w:p>
         </w:tc>
@@ -2175,7 +2101,7 @@
                 <w:sz w:val="20"/>
                 <w:szCs w:val="20"/>
               </w:rPr>
-              <w:t xml:space="preserve">$39,375</w:t>
+              <w:t xml:space="preserve">$50,625</w:t>
             </w:r>
           </w:p>
         </w:tc>
@@ -2273,7 +2199,7 @@
                 <w:sz w:val="20"/>
                 <w:szCs w:val="20"/>
               </w:rPr>
-              <w:t xml:space="preserve">25%</w:t>
+              <w:t xml:space="preserve">30%</w:t>
             </w:r>
           </w:p>
         </w:tc>
@@ -2297,7 +2223,7 @@
                 <w:sz w:val="20"/>
                 <w:szCs w:val="20"/>
               </w:rPr>
-              <w:t xml:space="preserve">$28,125</w:t>
+              <w:t xml:space="preserve">$33,750</w:t>
             </w:r>
           </w:p>
         </w:tc>
@@ -2321,7 +2247,7 @@
                 <w:sz w:val="20"/>
                 <w:szCs w:val="20"/>
               </w:rPr>
-              <w:t xml:space="preserve">$67,500</w:t>
+              <w:t xml:space="preserve">$84,375</w:t>
             </w:r>
           </w:p>
         </w:tc>
@@ -2419,7 +2345,7 @@
                 <w:sz w:val="20"/>
                 <w:szCs w:val="20"/>
               </w:rPr>
-              <w:t xml:space="preserve">30%</w:t>
+              <w:t xml:space="preserve">35%</w:t>
             </w:r>
           </w:p>
         </w:tc>
@@ -2443,7 +2369,7 @@
                 <w:sz w:val="20"/>
                 <w:szCs w:val="20"/>
               </w:rPr>
-              <w:t xml:space="preserve">$33,750</w:t>
+              <w:t xml:space="preserve">$39,375</w:t>
             </w:r>
           </w:p>
         </w:tc>
@@ -2467,7 +2393,7 @@
                 <w:sz w:val="20"/>
                 <w:szCs w:val="20"/>
               </w:rPr>
-              <w:t xml:space="preserve">$101,250</w:t>
+              <w:t xml:space="preserve">$123,750</w:t>
             </w:r>
           </w:p>
         </w:tc>
@@ -2569,7 +2495,7 @@
                 <w:sz w:val="20"/>
                 <w:szCs w:val="20"/>
               </w:rPr>
-              <w:t xml:space="preserve">35%</w:t>
+              <w:t xml:space="preserve">35% (cap)</w:t>
             </w:r>
           </w:p>
         </w:tc>
@@ -2619,7 +2545,7 @@
                 <w:sz w:val="20"/>
                 <w:szCs w:val="20"/>
               </w:rPr>
-              <w:t xml:space="preserve">$140,625</w:t>
+              <w:t xml:space="preserve">$163,125</w:t>
             </w:r>
           </w:p>
         </w:tc>
@@ -2783,16 +2709,16 @@
           <w:sz w:val="21"/>
           <w:szCs w:val="21"/>
         </w:rPr>
-        <w:t xml:space="preserve">House accounts and splits. </w:t>
-      </w:r>
-      <w:r>
-        <w:rPr>
-          <w:rFonts w:ascii="Open Sans" w:cs="Open Sans" w:eastAsia="Open Sans" w:hAnsi="Open Sans"/>
-          <w:color w:val="1D1D1B"/>
-          <w:sz w:val="21"/>
-          <w:szCs w:val="21"/>
-        </w:rPr>
-        <w:t xml:space="preserve">Accounts designated in writing by MMG as house accounts, and any commission splits between representatives, will be documented in a written schedule approved by MMG management before proposal approval.</w:t>
+        <w:t xml:space="preserve">Splits. </w:t>
+      </w:r>
+      <w:r>
+        <w:rPr>
+          <w:rFonts w:ascii="Open Sans" w:cs="Open Sans" w:eastAsia="Open Sans" w:hAnsi="Open Sans"/>
+          <w:color w:val="1D1D1B"/>
+          <w:sz w:val="21"/>
+          <w:szCs w:val="21"/>
+        </w:rPr>
+        <w:t xml:space="preserve">Any commission splits between representatives on a Named and Approved Account will be documented in a written schedule approved by MMG management before proposal approval.</w:t>
       </w:r>
     </w:p>
     <w:p>
@@ -3841,7 +3767,7 @@
           <w:sz w:val="26"/>
           <w:szCs w:val="26"/>
         </w:rPr>
-        <w:t xml:space="preserve">Exhibit B — Named Accounts</w:t>
+        <w:t xml:space="preserve">Exhibit B — Named and Approved Accounts</w:t>
       </w:r>
     </w:p>
     <w:p>
@@ -3855,7 +3781,7 @@
           <w:sz w:val="21"/>
           <w:szCs w:val="21"/>
         </w:rPr>
-        <w:t xml:space="preserve">Accounts assigned to the Sales Representative for commission purposes. All accounts not listed here are House Accounts or Other Sales Accounts. MMG may amend this list in writing.</w:t>
+        <w:t xml:space="preserve">Accounts (or scoped portions of accounts) requested by the Sales Representative and approved in writing by MMG as commissionable. Anything not listed here is non-commissionable by default. MMG may amend this list in writing at its sole discretion.</w:t>
       </w:r>
     </w:p>
     <w:tbl>
@@ -3871,14 +3797,14 @@
         </w:tblBorders>
       </w:tblPr>
       <w:tblGrid>
-        <w:gridCol w:w="4680"/>
-        <w:gridCol w:w="2340"/>
-        <w:gridCol w:w="2340"/>
+        <w:gridCol w:w="3600"/>
+        <w:gridCol w:w="3600"/>
+        <w:gridCol w:w="2160"/>
       </w:tblGrid>
       <w:tr>
         <w:tc>
           <w:tcPr>
-            <w:tcW w:type="dxa" w:w="4680"/>
+            <w:tcW w:type="dxa" w:w="3600"/>
             <w:shd w:fill="1D1D1B" w:val="clear"/>
             <w:tcMar>
               <w:top w:type="dxa" w:w="80"/>
@@ -3897,13 +3823,13 @@
                 <w:sz w:val="20"/>
                 <w:szCs w:val="20"/>
               </w:rPr>
-              <w:t xml:space="preserve">Named Account</w:t>
-            </w:r>
-          </w:p>
-        </w:tc>
-        <w:tc>
-          <w:tcPr>
-            <w:tcW w:type="dxa" w:w="2340"/>
+              <w:t xml:space="preserve">Named and Approved Account</w:t>
+            </w:r>
+          </w:p>
+        </w:tc>
+        <w:tc>
+          <w:tcPr>
+            <w:tcW w:type="dxa" w:w="3600"/>
             <w:shd w:fill="1D1D1B" w:val="clear"/>
             <w:tcMar>
               <w:top w:type="dxa" w:w="80"/>
@@ -3922,13 +3848,13 @@
                 <w:sz w:val="20"/>
                 <w:szCs w:val="20"/>
               </w:rPr>
-              <w:t xml:space="preserve">Effective date</w:t>
-            </w:r>
-          </w:p>
-        </w:tc>
-        <w:tc>
-          <w:tcPr>
-            <w:tcW w:type="dxa" w:w="2340"/>
+              <w:t xml:space="preserve">Approved scope (whole account / division / opportunity)</w:t>
+            </w:r>
+          </w:p>
+        </w:tc>
+        <w:tc>
+          <w:tcPr>
+            <w:tcW w:type="dxa" w:w="2160"/>
             <w:shd w:fill="1D1D1B" w:val="clear"/>
             <w:tcMar>
               <w:top w:type="dxa" w:w="80"/>
@@ -3947,7 +3873,7 @@
                 <w:sz w:val="20"/>
                 <w:szCs w:val="20"/>
               </w:rPr>
-              <w:t xml:space="preserve">Notes</w:t>
+              <w:t xml:space="preserve">Approval date</w:t>
             </w:r>
           </w:p>
         </w:tc>
@@ -3955,7 +3881,7 @@
       <w:tr>
         <w:tc>
           <w:tcPr>
-            <w:tcW w:type="dxa" w:w="4680"/>
+            <w:tcW w:type="dxa" w:w="3600"/>
             <w:tcMar>
               <w:top w:type="dxa" w:w="80"/>
               <w:left w:type="dxa" w:w="120"/>
@@ -3979,7 +3905,7 @@
         </w:tc>
         <w:tc>
           <w:tcPr>
-            <w:tcW w:type="dxa" w:w="2340"/>
+            <w:tcW w:type="dxa" w:w="3600"/>
             <w:tcMar>
               <w:top w:type="dxa" w:w="80"/>
               <w:left w:type="dxa" w:w="120"/>
@@ -4003,7 +3929,7 @@
         </w:tc>
         <w:tc>
           <w:tcPr>
-            <w:tcW w:type="dxa" w:w="2340"/>
+            <w:tcW w:type="dxa" w:w="2160"/>
             <w:tcMar>
               <w:top w:type="dxa" w:w="80"/>
               <w:left w:type="dxa" w:w="120"/>
@@ -4029,7 +3955,7 @@
       <w:tr>
         <w:tc>
           <w:tcPr>
-            <w:tcW w:type="dxa" w:w="4680"/>
+            <w:tcW w:type="dxa" w:w="3600"/>
             <w:tcMar>
               <w:top w:type="dxa" w:w="80"/>
               <w:left w:type="dxa" w:w="120"/>
@@ -4053,7 +3979,7 @@
         </w:tc>
         <w:tc>
           <w:tcPr>
-            <w:tcW w:type="dxa" w:w="2340"/>
+            <w:tcW w:type="dxa" w:w="3600"/>
             <w:tcMar>
               <w:top w:type="dxa" w:w="80"/>
               <w:left w:type="dxa" w:w="120"/>
@@ -4077,7 +4003,7 @@
         </w:tc>
         <w:tc>
           <w:tcPr>
-            <w:tcW w:type="dxa" w:w="2340"/>
+            <w:tcW w:type="dxa" w:w="2160"/>
             <w:tcMar>
               <w:top w:type="dxa" w:w="80"/>
               <w:left w:type="dxa" w:w="120"/>
@@ -4103,7 +4029,7 @@
       <w:tr>
         <w:tc>
           <w:tcPr>
-            <w:tcW w:type="dxa" w:w="4680"/>
+            <w:tcW w:type="dxa" w:w="3600"/>
             <w:tcMar>
               <w:top w:type="dxa" w:w="80"/>
               <w:left w:type="dxa" w:w="120"/>
@@ -4127,7 +4053,7 @@
         </w:tc>
         <w:tc>
           <w:tcPr>
-            <w:tcW w:type="dxa" w:w="2340"/>
+            <w:tcW w:type="dxa" w:w="3600"/>
             <w:tcMar>
               <w:top w:type="dxa" w:w="80"/>
               <w:left w:type="dxa" w:w="120"/>
@@ -4151,7 +4077,7 @@
         </w:tc>
         <w:tc>
           <w:tcPr>
-            <w:tcW w:type="dxa" w:w="2340"/>
+            <w:tcW w:type="dxa" w:w="2160"/>
             <w:tcMar>
               <w:top w:type="dxa" w:w="80"/>
               <w:left w:type="dxa" w:w="120"/>
@@ -4177,7 +4103,7 @@
       <w:tr>
         <w:tc>
           <w:tcPr>
-            <w:tcW w:type="dxa" w:w="4680"/>
+            <w:tcW w:type="dxa" w:w="3600"/>
             <w:tcMar>
               <w:top w:type="dxa" w:w="80"/>
               <w:left w:type="dxa" w:w="120"/>
@@ -4201,7 +4127,7 @@
         </w:tc>
         <w:tc>
           <w:tcPr>
-            <w:tcW w:type="dxa" w:w="2340"/>
+            <w:tcW w:type="dxa" w:w="3600"/>
             <w:tcMar>
               <w:top w:type="dxa" w:w="80"/>
               <w:left w:type="dxa" w:w="120"/>
@@ -4225,7 +4151,7 @@
         </w:tc>
         <w:tc>
           <w:tcPr>
-            <w:tcW w:type="dxa" w:w="2340"/>
+            <w:tcW w:type="dxa" w:w="2160"/>
             <w:tcMar>
               <w:top w:type="dxa" w:w="80"/>
               <w:left w:type="dxa" w:w="120"/>
@@ -4251,7 +4177,7 @@
       <w:tr>
         <w:tc>
           <w:tcPr>
-            <w:tcW w:type="dxa" w:w="4680"/>
+            <w:tcW w:type="dxa" w:w="3600"/>
             <w:tcMar>
               <w:top w:type="dxa" w:w="80"/>
               <w:left w:type="dxa" w:w="120"/>
@@ -4275,7 +4201,7 @@
         </w:tc>
         <w:tc>
           <w:tcPr>
-            <w:tcW w:type="dxa" w:w="2340"/>
+            <w:tcW w:type="dxa" w:w="3600"/>
             <w:tcMar>
               <w:top w:type="dxa" w:w="80"/>
               <w:left w:type="dxa" w:w="120"/>
@@ -4299,7 +4225,7 @@
         </w:tc>
         <w:tc>
           <w:tcPr>
-            <w:tcW w:type="dxa" w:w="2340"/>
+            <w:tcW w:type="dxa" w:w="2160"/>
             <w:tcMar>
               <w:top w:type="dxa" w:w="80"/>
               <w:left w:type="dxa" w:w="120"/>

</xml_diff>

<commit_message>
Set commission tiers to 25/27.5/30/32.5/35% with cap at $1M gate
Co-Authored-By: Claude Fable 5 <noreply@anthropic.com>
Claude-Session: https://claude.ai/code/session_019EoJuzBaRKmij9AN1LjC6F
</commit_message>
<xml_diff>
--- a/docs/mmg/sales-compensation/MMG - Sales Commission Agreement - v1.docx
+++ b/docs/mmg/sales-compensation/MMG - Sales Commission Agreement - v1.docx
@@ -1139,7 +1139,7 @@
           <w:sz w:val="21"/>
           <w:szCs w:val="21"/>
         </w:rPr>
-        <w:t xml:space="preserve">The Commission Rate starts at 20% and is capped at 35%. It steps up as Cumulative Named-Account Revenue grows during the Plan Year, per the table below. Rates are incremental (marginal): each rate applies only to the Gross Profit (CGP) attributable to revenue falling within that band — crossing a threshold does not retroactively change the rate on earlier revenue. If a single engagement spans a threshold, its CGP is apportioned pro-rata between the bands.</w:t>
+        <w:t xml:space="preserve">The Commission Rate starts at 25% and is capped at 35%, which is reached once Cumulative Named-Account Revenue exceeds $1,000,000. It steps up as Cumulative Named-Account Revenue grows during the Plan Year, per the table below. Rates are incremental (marginal): each rate applies only to the Gross Profit (CGP) attributable to revenue falling within that band — crossing a threshold does not retroactively change the rate on earlier revenue. If a single engagement spans a threshold, its CGP is apportioned pro-rata between the bands.</w:t>
       </w:r>
     </w:p>
     <w:p>
@@ -1397,7 +1397,7 @@
                 <w:sz w:val="20"/>
                 <w:szCs w:val="20"/>
               </w:rPr>
-              <w:t xml:space="preserve">20%</w:t>
+              <w:t xml:space="preserve">25%</w:t>
             </w:r>
           </w:p>
         </w:tc>
@@ -1471,7 +1471,7 @@
                 <w:sz w:val="20"/>
                 <w:szCs w:val="20"/>
               </w:rPr>
-              <w:t xml:space="preserve">25%</w:t>
+              <w:t xml:space="preserve">27.5%</w:t>
             </w:r>
           </w:p>
         </w:tc>
@@ -1554,6 +1554,80 @@
         <w:tc>
           <w:tcPr>
             <w:tcW w:type="dxa" w:w="900"/>
+            <w:tcMar>
+              <w:top w:type="dxa" w:w="80"/>
+              <w:left w:type="dxa" w:w="120"/>
+              <w:bottom w:type="dxa" w:w="80"/>
+              <w:right w:type="dxa" w:w="120"/>
+            </w:tcMar>
+          </w:tcPr>
+          <w:p>
+            <w:r>
+              <w:rPr>
+                <w:rFonts w:ascii="Open Sans" w:cs="Open Sans" w:eastAsia="Open Sans" w:hAnsi="Open Sans"/>
+                <w:b w:val="false"/>
+                <w:bCs w:val="false"/>
+                <w:color w:val="1D1D1B"/>
+                <w:sz w:val="20"/>
+                <w:szCs w:val="20"/>
+              </w:rPr>
+              <w:t xml:space="preserve">4</w:t>
+            </w:r>
+          </w:p>
+        </w:tc>
+        <w:tc>
+          <w:tcPr>
+            <w:tcW w:type="dxa" w:w="5400"/>
+            <w:tcMar>
+              <w:top w:type="dxa" w:w="80"/>
+              <w:left w:type="dxa" w:w="120"/>
+              <w:bottom w:type="dxa" w:w="80"/>
+              <w:right w:type="dxa" w:w="120"/>
+            </w:tcMar>
+          </w:tcPr>
+          <w:p>
+            <w:r>
+              <w:rPr>
+                <w:rFonts w:ascii="Open Sans" w:cs="Open Sans" w:eastAsia="Open Sans" w:hAnsi="Open Sans"/>
+                <w:b w:val="false"/>
+                <w:bCs w:val="false"/>
+                <w:color w:val="1D1D1B"/>
+                <w:sz w:val="20"/>
+                <w:szCs w:val="20"/>
+              </w:rPr>
+              <w:t xml:space="preserve">Over $750,000 up to $1,000,000</w:t>
+            </w:r>
+          </w:p>
+        </w:tc>
+        <w:tc>
+          <w:tcPr>
+            <w:tcW w:type="dxa" w:w="3060"/>
+            <w:tcMar>
+              <w:top w:type="dxa" w:w="80"/>
+              <w:left w:type="dxa" w:w="120"/>
+              <w:bottom w:type="dxa" w:w="80"/>
+              <w:right w:type="dxa" w:w="120"/>
+            </w:tcMar>
+          </w:tcPr>
+          <w:p>
+            <w:r>
+              <w:rPr>
+                <w:rFonts w:ascii="Open Sans" w:cs="Open Sans" w:eastAsia="Open Sans" w:hAnsi="Open Sans"/>
+                <w:b w:val="false"/>
+                <w:bCs w:val="false"/>
+                <w:color w:val="1D1D1B"/>
+                <w:sz w:val="20"/>
+                <w:szCs w:val="20"/>
+              </w:rPr>
+              <w:t xml:space="preserve">32.5%</w:t>
+            </w:r>
+          </w:p>
+        </w:tc>
+      </w:tr>
+      <w:tr>
+        <w:tc>
+          <w:tcPr>
+            <w:tcW w:type="dxa" w:w="900"/>
             <w:shd w:fill="FFE4EA" w:val="clear"/>
             <w:tcMar>
               <w:top w:type="dxa" w:w="80"/>
@@ -1572,7 +1646,7 @@
                 <w:sz w:val="20"/>
                 <w:szCs w:val="20"/>
               </w:rPr>
-              <w:t xml:space="preserve">4</w:t>
+              <w:t xml:space="preserve">5</w:t>
             </w:r>
           </w:p>
         </w:tc>
@@ -1597,7 +1671,7 @@
                 <w:sz w:val="20"/>
                 <w:szCs w:val="20"/>
               </w:rPr>
-              <w:t xml:space="preserve">Over $750,000</w:t>
+              <w:t xml:space="preserve">Over $1,000,000</w:t>
             </w:r>
           </w:p>
         </w:tc>
@@ -1907,7 +1981,7 @@
                 <w:sz w:val="20"/>
                 <w:szCs w:val="20"/>
               </w:rPr>
-              <w:t xml:space="preserve">20%</w:t>
+              <w:t xml:space="preserve">25%</w:t>
             </w:r>
           </w:p>
         </w:tc>
@@ -1931,7 +2005,7 @@
                 <w:sz w:val="20"/>
                 <w:szCs w:val="20"/>
               </w:rPr>
-              <w:t xml:space="preserve">$22,500</w:t>
+              <w:t xml:space="preserve">$28,125</w:t>
             </w:r>
           </w:p>
         </w:tc>
@@ -1955,7 +2029,7 @@
                 <w:sz w:val="20"/>
                 <w:szCs w:val="20"/>
               </w:rPr>
-              <w:t xml:space="preserve">$22,500</w:t>
+              <w:t xml:space="preserve">$28,125</w:t>
             </w:r>
           </w:p>
         </w:tc>
@@ -2053,7 +2127,7 @@
                 <w:sz w:val="20"/>
                 <w:szCs w:val="20"/>
               </w:rPr>
-              <w:t xml:space="preserve">25%</w:t>
+              <w:t xml:space="preserve">27.5%</w:t>
             </w:r>
           </w:p>
         </w:tc>
@@ -2077,7 +2151,7 @@
                 <w:sz w:val="20"/>
                 <w:szCs w:val="20"/>
               </w:rPr>
-              <w:t xml:space="preserve">$28,125</w:t>
+              <w:t xml:space="preserve">$30,938</w:t>
             </w:r>
           </w:p>
         </w:tc>
@@ -2101,7 +2175,7 @@
                 <w:sz w:val="20"/>
                 <w:szCs w:val="20"/>
               </w:rPr>
-              <w:t xml:space="preserve">$50,625</w:t>
+              <w:t xml:space="preserve">$59,063</w:t>
             </w:r>
           </w:p>
         </w:tc>
@@ -2247,7 +2321,7 @@
                 <w:sz w:val="20"/>
                 <w:szCs w:val="20"/>
               </w:rPr>
-              <w:t xml:space="preserve">$84,375</w:t>
+              <w:t xml:space="preserve">$92,813</w:t>
             </w:r>
           </w:p>
         </w:tc>
@@ -2345,7 +2419,7 @@
                 <w:sz w:val="20"/>
                 <w:szCs w:val="20"/>
               </w:rPr>
-              <w:t xml:space="preserve">35%</w:t>
+              <w:t xml:space="preserve">32.5%</w:t>
             </w:r>
           </w:p>
         </w:tc>
@@ -2369,7 +2443,7 @@
                 <w:sz w:val="20"/>
                 <w:szCs w:val="20"/>
               </w:rPr>
-              <w:t xml:space="preserve">$39,375</w:t>
+              <w:t xml:space="preserve">$36,563</w:t>
             </w:r>
           </w:p>
         </w:tc>
@@ -2393,7 +2467,7 @@
                 <w:sz w:val="20"/>
                 <w:szCs w:val="20"/>
               </w:rPr>
-              <w:t xml:space="preserve">$123,750</w:t>
+              <w:t xml:space="preserve">$129,375</w:t>
             </w:r>
           </w:p>
         </w:tc>
@@ -2545,7 +2619,7 @@
                 <w:sz w:val="20"/>
                 <w:szCs w:val="20"/>
               </w:rPr>
-              <w:t xml:space="preserve">$163,125</w:t>
+              <w:t xml:space="preserve">$168,750</w:t>
             </w:r>
           </w:p>
         </w:tc>

</xml_diff>

<commit_message>
Simplify tiers to 3 bands (25/30/35% cap over $500K), add % of revenue column
Co-Authored-By: Claude Fable 5 <noreply@anthropic.com>
Claude-Session: https://claude.ai/code/session_019EoJuzBaRKmij9AN1LjC6F
</commit_message>
<xml_diff>
--- a/docs/mmg/sales-compensation/MMG - Sales Commission Agreement - v1.docx
+++ b/docs/mmg/sales-compensation/MMG - Sales Commission Agreement - v1.docx
@@ -1139,7 +1139,7 @@
           <w:sz w:val="21"/>
           <w:szCs w:val="21"/>
         </w:rPr>
-        <w:t xml:space="preserve">The Commission Rate starts at 25% and is capped at 35%, which is reached once Cumulative Named-Account Revenue exceeds $1,000,000. It steps up as Cumulative Named-Account Revenue grows during the Plan Year, per the table below. Rates are incremental (marginal): each rate applies only to the Gross Profit (CGP) attributable to revenue falling within that band — crossing a threshold does not retroactively change the rate on earlier revenue. If a single engagement spans a threshold, its CGP is apportioned pro-rata between the bands.</w:t>
+        <w:t xml:space="preserve">The Commission Rate starts at 25% and is capped at 35%, which is reached once Cumulative Named-Account Revenue exceeds $500,000. It steps up as Cumulative Named-Account Revenue grows during the Plan Year, per the table below. Rates are incremental (marginal): each rate applies only to the Gross Profit (CGP) attributable to revenue falling within that band — crossing a threshold does not retroactively change the rate on earlier revenue. If a single engagement spans a threshold, its CGP is apportioned pro-rata between the bands.</w:t>
       </w:r>
     </w:p>
     <w:p>
@@ -1471,7 +1471,7 @@
                 <w:sz w:val="20"/>
                 <w:szCs w:val="20"/>
               </w:rPr>
-              <w:t xml:space="preserve">27.5%</w:t>
+              <w:t xml:space="preserve">30%</w:t>
             </w:r>
           </w:p>
         </w:tc>
@@ -1480,154 +1480,6 @@
         <w:tc>
           <w:tcPr>
             <w:tcW w:type="dxa" w:w="900"/>
-            <w:tcMar>
-              <w:top w:type="dxa" w:w="80"/>
-              <w:left w:type="dxa" w:w="120"/>
-              <w:bottom w:type="dxa" w:w="80"/>
-              <w:right w:type="dxa" w:w="120"/>
-            </w:tcMar>
-          </w:tcPr>
-          <w:p>
-            <w:r>
-              <w:rPr>
-                <w:rFonts w:ascii="Open Sans" w:cs="Open Sans" w:eastAsia="Open Sans" w:hAnsi="Open Sans"/>
-                <w:b w:val="false"/>
-                <w:bCs w:val="false"/>
-                <w:color w:val="1D1D1B"/>
-                <w:sz w:val="20"/>
-                <w:szCs w:val="20"/>
-              </w:rPr>
-              <w:t xml:space="preserve">3</w:t>
-            </w:r>
-          </w:p>
-        </w:tc>
-        <w:tc>
-          <w:tcPr>
-            <w:tcW w:type="dxa" w:w="5400"/>
-            <w:tcMar>
-              <w:top w:type="dxa" w:w="80"/>
-              <w:left w:type="dxa" w:w="120"/>
-              <w:bottom w:type="dxa" w:w="80"/>
-              <w:right w:type="dxa" w:w="120"/>
-            </w:tcMar>
-          </w:tcPr>
-          <w:p>
-            <w:r>
-              <w:rPr>
-                <w:rFonts w:ascii="Open Sans" w:cs="Open Sans" w:eastAsia="Open Sans" w:hAnsi="Open Sans"/>
-                <w:b w:val="false"/>
-                <w:bCs w:val="false"/>
-                <w:color w:val="1D1D1B"/>
-                <w:sz w:val="20"/>
-                <w:szCs w:val="20"/>
-              </w:rPr>
-              <w:t xml:space="preserve">Over $500,000 up to $750,000</w:t>
-            </w:r>
-          </w:p>
-        </w:tc>
-        <w:tc>
-          <w:tcPr>
-            <w:tcW w:type="dxa" w:w="3060"/>
-            <w:tcMar>
-              <w:top w:type="dxa" w:w="80"/>
-              <w:left w:type="dxa" w:w="120"/>
-              <w:bottom w:type="dxa" w:w="80"/>
-              <w:right w:type="dxa" w:w="120"/>
-            </w:tcMar>
-          </w:tcPr>
-          <w:p>
-            <w:r>
-              <w:rPr>
-                <w:rFonts w:ascii="Open Sans" w:cs="Open Sans" w:eastAsia="Open Sans" w:hAnsi="Open Sans"/>
-                <w:b w:val="false"/>
-                <w:bCs w:val="false"/>
-                <w:color w:val="1D1D1B"/>
-                <w:sz w:val="20"/>
-                <w:szCs w:val="20"/>
-              </w:rPr>
-              <w:t xml:space="preserve">30%</w:t>
-            </w:r>
-          </w:p>
-        </w:tc>
-      </w:tr>
-      <w:tr>
-        <w:tc>
-          <w:tcPr>
-            <w:tcW w:type="dxa" w:w="900"/>
-            <w:tcMar>
-              <w:top w:type="dxa" w:w="80"/>
-              <w:left w:type="dxa" w:w="120"/>
-              <w:bottom w:type="dxa" w:w="80"/>
-              <w:right w:type="dxa" w:w="120"/>
-            </w:tcMar>
-          </w:tcPr>
-          <w:p>
-            <w:r>
-              <w:rPr>
-                <w:rFonts w:ascii="Open Sans" w:cs="Open Sans" w:eastAsia="Open Sans" w:hAnsi="Open Sans"/>
-                <w:b w:val="false"/>
-                <w:bCs w:val="false"/>
-                <w:color w:val="1D1D1B"/>
-                <w:sz w:val="20"/>
-                <w:szCs w:val="20"/>
-              </w:rPr>
-              <w:t xml:space="preserve">4</w:t>
-            </w:r>
-          </w:p>
-        </w:tc>
-        <w:tc>
-          <w:tcPr>
-            <w:tcW w:type="dxa" w:w="5400"/>
-            <w:tcMar>
-              <w:top w:type="dxa" w:w="80"/>
-              <w:left w:type="dxa" w:w="120"/>
-              <w:bottom w:type="dxa" w:w="80"/>
-              <w:right w:type="dxa" w:w="120"/>
-            </w:tcMar>
-          </w:tcPr>
-          <w:p>
-            <w:r>
-              <w:rPr>
-                <w:rFonts w:ascii="Open Sans" w:cs="Open Sans" w:eastAsia="Open Sans" w:hAnsi="Open Sans"/>
-                <w:b w:val="false"/>
-                <w:bCs w:val="false"/>
-                <w:color w:val="1D1D1B"/>
-                <w:sz w:val="20"/>
-                <w:szCs w:val="20"/>
-              </w:rPr>
-              <w:t xml:space="preserve">Over $750,000 up to $1,000,000</w:t>
-            </w:r>
-          </w:p>
-        </w:tc>
-        <w:tc>
-          <w:tcPr>
-            <w:tcW w:type="dxa" w:w="3060"/>
-            <w:tcMar>
-              <w:top w:type="dxa" w:w="80"/>
-              <w:left w:type="dxa" w:w="120"/>
-              <w:bottom w:type="dxa" w:w="80"/>
-              <w:right w:type="dxa" w:w="120"/>
-            </w:tcMar>
-          </w:tcPr>
-          <w:p>
-            <w:r>
-              <w:rPr>
-                <w:rFonts w:ascii="Open Sans" w:cs="Open Sans" w:eastAsia="Open Sans" w:hAnsi="Open Sans"/>
-                <w:b w:val="false"/>
-                <w:bCs w:val="false"/>
-                <w:color w:val="1D1D1B"/>
-                <w:sz w:val="20"/>
-                <w:szCs w:val="20"/>
-              </w:rPr>
-              <w:t xml:space="preserve">32.5%</w:t>
-            </w:r>
-          </w:p>
-        </w:tc>
-      </w:tr>
-      <w:tr>
-        <w:tc>
-          <w:tcPr>
-            <w:tcW w:type="dxa" w:w="900"/>
             <w:shd w:fill="FFE4EA" w:val="clear"/>
             <w:tcMar>
               <w:top w:type="dxa" w:w="80"/>
@@ -1646,7 +1498,7 @@
                 <w:sz w:val="20"/>
                 <w:szCs w:val="20"/>
               </w:rPr>
-              <w:t xml:space="preserve">5</w:t>
+              <w:t xml:space="preserve">3</w:t>
             </w:r>
           </w:p>
         </w:tc>
@@ -1671,7 +1523,7 @@
                 <w:sz w:val="20"/>
                 <w:szCs w:val="20"/>
               </w:rPr>
-              <w:t xml:space="preserve">Over $1,000,000</w:t>
+              <w:t xml:space="preserve">Over $500,000</w:t>
             </w:r>
           </w:p>
         </w:tc>
@@ -1729,17 +1581,18 @@
         </w:tblBorders>
       </w:tblPr>
       <w:tblGrid>
-        <w:gridCol w:w="2340"/>
+        <w:gridCol w:w="2100"/>
+        <w:gridCol w:w="1350"/>
         <w:gridCol w:w="1500"/>
-        <w:gridCol w:w="1800"/>
         <w:gridCol w:w="800"/>
-        <w:gridCol w:w="1500"/>
-        <w:gridCol w:w="1420"/>
+        <w:gridCol w:w="1300"/>
+        <w:gridCol w:w="1200"/>
+        <w:gridCol w:w="1110"/>
       </w:tblGrid>
       <w:tr>
         <w:tc>
           <w:tcPr>
-            <w:tcW w:type="dxa" w:w="2340"/>
+            <w:tcW w:type="dxa" w:w="2100"/>
             <w:shd w:fill="1D1D1B" w:val="clear"/>
             <w:tcMar>
               <w:top w:type="dxa" w:w="80"/>
@@ -1764,7 +1617,7 @@
         </w:tc>
         <w:tc>
           <w:tcPr>
-            <w:tcW w:type="dxa" w:w="1500"/>
+            <w:tcW w:type="dxa" w:w="1350"/>
             <w:shd w:fill="1D1D1B" w:val="clear"/>
             <w:tcMar>
               <w:top w:type="dxa" w:w="80"/>
@@ -1789,7 +1642,7 @@
         </w:tc>
         <w:tc>
           <w:tcPr>
-            <w:tcW w:type="dxa" w:w="1800"/>
+            <w:tcW w:type="dxa" w:w="1500"/>
             <w:shd w:fill="1D1D1B" w:val="clear"/>
             <w:tcMar>
               <w:top w:type="dxa" w:w="80"/>
@@ -1839,7 +1692,7 @@
         </w:tc>
         <w:tc>
           <w:tcPr>
-            <w:tcW w:type="dxa" w:w="1500"/>
+            <w:tcW w:type="dxa" w:w="1300"/>
             <w:shd w:fill="1D1D1B" w:val="clear"/>
             <w:tcMar>
               <w:top w:type="dxa" w:w="80"/>
@@ -1864,7 +1717,7 @@
         </w:tc>
         <w:tc>
           <w:tcPr>
-            <w:tcW w:type="dxa" w:w="1420"/>
+            <w:tcW w:type="dxa" w:w="1200"/>
             <w:shd w:fill="1D1D1B" w:val="clear"/>
             <w:tcMar>
               <w:top w:type="dxa" w:w="80"/>
@@ -1883,6 +1736,31 @@
                 <w:sz w:val="20"/>
                 <w:szCs w:val="20"/>
               </w:rPr>
+              <w:t xml:space="preserve">Commission as % of Revenue</w:t>
+            </w:r>
+          </w:p>
+        </w:tc>
+        <w:tc>
+          <w:tcPr>
+            <w:tcW w:type="dxa" w:w="1110"/>
+            <w:shd w:fill="1D1D1B" w:val="clear"/>
+            <w:tcMar>
+              <w:top w:type="dxa" w:w="80"/>
+              <w:left w:type="dxa" w:w="120"/>
+              <w:bottom w:type="dxa" w:w="80"/>
+              <w:right w:type="dxa" w:w="120"/>
+            </w:tcMar>
+          </w:tcPr>
+          <w:p>
+            <w:r>
+              <w:rPr>
+                <w:rFonts w:ascii="Open Sans" w:cs="Open Sans" w:eastAsia="Open Sans" w:hAnsi="Open Sans"/>
+                <w:b/>
+                <w:bCs/>
+                <w:color w:val="FFFFFF"/>
+                <w:sz w:val="20"/>
+                <w:szCs w:val="20"/>
+              </w:rPr>
               <w:t xml:space="preserve">Cumulative commission</w:t>
             </w:r>
           </w:p>
@@ -1891,7 +1769,7 @@
       <w:tr>
         <w:tc>
           <w:tcPr>
-            <w:tcW w:type="dxa" w:w="2340"/>
+            <w:tcW w:type="dxa" w:w="2100"/>
             <w:tcMar>
               <w:top w:type="dxa" w:w="80"/>
               <w:left w:type="dxa" w:w="120"/>
@@ -1915,6 +1793,30 @@
         </w:tc>
         <w:tc>
           <w:tcPr>
+            <w:tcW w:type="dxa" w:w="1350"/>
+            <w:tcMar>
+              <w:top w:type="dxa" w:w="80"/>
+              <w:left w:type="dxa" w:w="120"/>
+              <w:bottom w:type="dxa" w:w="80"/>
+              <w:right w:type="dxa" w:w="120"/>
+            </w:tcMar>
+          </w:tcPr>
+          <w:p>
+            <w:r>
+              <w:rPr>
+                <w:rFonts w:ascii="Open Sans" w:cs="Open Sans" w:eastAsia="Open Sans" w:hAnsi="Open Sans"/>
+                <w:b w:val="false"/>
+                <w:bCs w:val="false"/>
+                <w:color w:val="1D1D1B"/>
+                <w:sz w:val="20"/>
+                <w:szCs w:val="20"/>
+              </w:rPr>
+              <w:t xml:space="preserve">$250,000</w:t>
+            </w:r>
+          </w:p>
+        </w:tc>
+        <w:tc>
+          <w:tcPr>
             <w:tcW w:type="dxa" w:w="1500"/>
             <w:tcMar>
               <w:top w:type="dxa" w:w="80"/>
@@ -1933,30 +1835,6 @@
                 <w:sz w:val="20"/>
                 <w:szCs w:val="20"/>
               </w:rPr>
-              <w:t xml:space="preserve">$250,000</w:t>
-            </w:r>
-          </w:p>
-        </w:tc>
-        <w:tc>
-          <w:tcPr>
-            <w:tcW w:type="dxa" w:w="1800"/>
-            <w:tcMar>
-              <w:top w:type="dxa" w:w="80"/>
-              <w:left w:type="dxa" w:w="120"/>
-              <w:bottom w:type="dxa" w:w="80"/>
-              <w:right w:type="dxa" w:w="120"/>
-            </w:tcMar>
-          </w:tcPr>
-          <w:p>
-            <w:r>
-              <w:rPr>
-                <w:rFonts w:ascii="Open Sans" w:cs="Open Sans" w:eastAsia="Open Sans" w:hAnsi="Open Sans"/>
-                <w:b w:val="false"/>
-                <w:bCs w:val="false"/>
-                <w:color w:val="1D1D1B"/>
-                <w:sz w:val="20"/>
-                <w:szCs w:val="20"/>
-              </w:rPr>
               <w:t xml:space="preserve">$112,500</w:t>
             </w:r>
           </w:p>
@@ -1987,7 +1865,7 @@
         </w:tc>
         <w:tc>
           <w:tcPr>
-            <w:tcW w:type="dxa" w:w="1500"/>
+            <w:tcW w:type="dxa" w:w="1300"/>
             <w:tcMar>
               <w:top w:type="dxa" w:w="80"/>
               <w:left w:type="dxa" w:w="120"/>
@@ -2011,7 +1889,31 @@
         </w:tc>
         <w:tc>
           <w:tcPr>
-            <w:tcW w:type="dxa" w:w="1420"/>
+            <w:tcW w:type="dxa" w:w="1200"/>
+            <w:tcMar>
+              <w:top w:type="dxa" w:w="80"/>
+              <w:left w:type="dxa" w:w="120"/>
+              <w:bottom w:type="dxa" w:w="80"/>
+              <w:right w:type="dxa" w:w="120"/>
+            </w:tcMar>
+          </w:tcPr>
+          <w:p>
+            <w:r>
+              <w:rPr>
+                <w:rFonts w:ascii="Open Sans" w:cs="Open Sans" w:eastAsia="Open Sans" w:hAnsi="Open Sans"/>
+                <w:b w:val="false"/>
+                <w:bCs w:val="false"/>
+                <w:color w:val="1D1D1B"/>
+                <w:sz w:val="20"/>
+                <w:szCs w:val="20"/>
+              </w:rPr>
+              <w:t xml:space="preserve">11.25%</w:t>
+            </w:r>
+          </w:p>
+        </w:tc>
+        <w:tc>
+          <w:tcPr>
+            <w:tcW w:type="dxa" w:w="1110"/>
             <w:tcMar>
               <w:top w:type="dxa" w:w="80"/>
               <w:left w:type="dxa" w:w="120"/>
@@ -2037,7 +1939,7 @@
       <w:tr>
         <w:tc>
           <w:tcPr>
-            <w:tcW w:type="dxa" w:w="2340"/>
+            <w:tcW w:type="dxa" w:w="2100"/>
             <w:tcMar>
               <w:top w:type="dxa" w:w="80"/>
               <w:left w:type="dxa" w:w="120"/>
@@ -2061,6 +1963,30 @@
         </w:tc>
         <w:tc>
           <w:tcPr>
+            <w:tcW w:type="dxa" w:w="1350"/>
+            <w:tcMar>
+              <w:top w:type="dxa" w:w="80"/>
+              <w:left w:type="dxa" w:w="120"/>
+              <w:bottom w:type="dxa" w:w="80"/>
+              <w:right w:type="dxa" w:w="120"/>
+            </w:tcMar>
+          </w:tcPr>
+          <w:p>
+            <w:r>
+              <w:rPr>
+                <w:rFonts w:ascii="Open Sans" w:cs="Open Sans" w:eastAsia="Open Sans" w:hAnsi="Open Sans"/>
+                <w:b w:val="false"/>
+                <w:bCs w:val="false"/>
+                <w:color w:val="1D1D1B"/>
+                <w:sz w:val="20"/>
+                <w:szCs w:val="20"/>
+              </w:rPr>
+              <w:t xml:space="preserve">$250,000</w:t>
+            </w:r>
+          </w:p>
+        </w:tc>
+        <w:tc>
+          <w:tcPr>
             <w:tcW w:type="dxa" w:w="1500"/>
             <w:tcMar>
               <w:top w:type="dxa" w:w="80"/>
@@ -2079,30 +2005,6 @@
                 <w:sz w:val="20"/>
                 <w:szCs w:val="20"/>
               </w:rPr>
-              <w:t xml:space="preserve">$250,000</w:t>
-            </w:r>
-          </w:p>
-        </w:tc>
-        <w:tc>
-          <w:tcPr>
-            <w:tcW w:type="dxa" w:w="1800"/>
-            <w:tcMar>
-              <w:top w:type="dxa" w:w="80"/>
-              <w:left w:type="dxa" w:w="120"/>
-              <w:bottom w:type="dxa" w:w="80"/>
-              <w:right w:type="dxa" w:w="120"/>
-            </w:tcMar>
-          </w:tcPr>
-          <w:p>
-            <w:r>
-              <w:rPr>
-                <w:rFonts w:ascii="Open Sans" w:cs="Open Sans" w:eastAsia="Open Sans" w:hAnsi="Open Sans"/>
-                <w:b w:val="false"/>
-                <w:bCs w:val="false"/>
-                <w:color w:val="1D1D1B"/>
-                <w:sz w:val="20"/>
-                <w:szCs w:val="20"/>
-              </w:rPr>
               <w:t xml:space="preserve">$112,500</w:t>
             </w:r>
           </w:p>
@@ -2127,55 +2029,79 @@
                 <w:sz w:val="20"/>
                 <w:szCs w:val="20"/>
               </w:rPr>
-              <w:t xml:space="preserve">27.5%</w:t>
-            </w:r>
-          </w:p>
-        </w:tc>
-        <w:tc>
-          <w:tcPr>
-            <w:tcW w:type="dxa" w:w="1500"/>
-            <w:tcMar>
-              <w:top w:type="dxa" w:w="80"/>
-              <w:left w:type="dxa" w:w="120"/>
-              <w:bottom w:type="dxa" w:w="80"/>
-              <w:right w:type="dxa" w:w="120"/>
-            </w:tcMar>
-          </w:tcPr>
-          <w:p>
-            <w:r>
-              <w:rPr>
-                <w:rFonts w:ascii="Open Sans" w:cs="Open Sans" w:eastAsia="Open Sans" w:hAnsi="Open Sans"/>
-                <w:b w:val="false"/>
-                <w:bCs w:val="false"/>
-                <w:color w:val="1D1D1B"/>
-                <w:sz w:val="20"/>
-                <w:szCs w:val="20"/>
-              </w:rPr>
-              <w:t xml:space="preserve">$30,938</w:t>
-            </w:r>
-          </w:p>
-        </w:tc>
-        <w:tc>
-          <w:tcPr>
-            <w:tcW w:type="dxa" w:w="1420"/>
-            <w:tcMar>
-              <w:top w:type="dxa" w:w="80"/>
-              <w:left w:type="dxa" w:w="120"/>
-              <w:bottom w:type="dxa" w:w="80"/>
-              <w:right w:type="dxa" w:w="120"/>
-            </w:tcMar>
-          </w:tcPr>
-          <w:p>
-            <w:r>
-              <w:rPr>
-                <w:rFonts w:ascii="Open Sans" w:cs="Open Sans" w:eastAsia="Open Sans" w:hAnsi="Open Sans"/>
-                <w:b w:val="false"/>
-                <w:bCs w:val="false"/>
-                <w:color w:val="1D1D1B"/>
-                <w:sz w:val="20"/>
-                <w:szCs w:val="20"/>
-              </w:rPr>
-              <w:t xml:space="preserve">$59,063</w:t>
+              <w:t xml:space="preserve">30%</w:t>
+            </w:r>
+          </w:p>
+        </w:tc>
+        <w:tc>
+          <w:tcPr>
+            <w:tcW w:type="dxa" w:w="1300"/>
+            <w:tcMar>
+              <w:top w:type="dxa" w:w="80"/>
+              <w:left w:type="dxa" w:w="120"/>
+              <w:bottom w:type="dxa" w:w="80"/>
+              <w:right w:type="dxa" w:w="120"/>
+            </w:tcMar>
+          </w:tcPr>
+          <w:p>
+            <w:r>
+              <w:rPr>
+                <w:rFonts w:ascii="Open Sans" w:cs="Open Sans" w:eastAsia="Open Sans" w:hAnsi="Open Sans"/>
+                <w:b w:val="false"/>
+                <w:bCs w:val="false"/>
+                <w:color w:val="1D1D1B"/>
+                <w:sz w:val="20"/>
+                <w:szCs w:val="20"/>
+              </w:rPr>
+              <w:t xml:space="preserve">$33,750</w:t>
+            </w:r>
+          </w:p>
+        </w:tc>
+        <w:tc>
+          <w:tcPr>
+            <w:tcW w:type="dxa" w:w="1200"/>
+            <w:tcMar>
+              <w:top w:type="dxa" w:w="80"/>
+              <w:left w:type="dxa" w:w="120"/>
+              <w:bottom w:type="dxa" w:w="80"/>
+              <w:right w:type="dxa" w:w="120"/>
+            </w:tcMar>
+          </w:tcPr>
+          <w:p>
+            <w:r>
+              <w:rPr>
+                <w:rFonts w:ascii="Open Sans" w:cs="Open Sans" w:eastAsia="Open Sans" w:hAnsi="Open Sans"/>
+                <w:b w:val="false"/>
+                <w:bCs w:val="false"/>
+                <w:color w:val="1D1D1B"/>
+                <w:sz w:val="20"/>
+                <w:szCs w:val="20"/>
+              </w:rPr>
+              <w:t xml:space="preserve">13.5%</w:t>
+            </w:r>
+          </w:p>
+        </w:tc>
+        <w:tc>
+          <w:tcPr>
+            <w:tcW w:type="dxa" w:w="1110"/>
+            <w:tcMar>
+              <w:top w:type="dxa" w:w="80"/>
+              <w:left w:type="dxa" w:w="120"/>
+              <w:bottom w:type="dxa" w:w="80"/>
+              <w:right w:type="dxa" w:w="120"/>
+            </w:tcMar>
+          </w:tcPr>
+          <w:p>
+            <w:r>
+              <w:rPr>
+                <w:rFonts w:ascii="Open Sans" w:cs="Open Sans" w:eastAsia="Open Sans" w:hAnsi="Open Sans"/>
+                <w:b w:val="false"/>
+                <w:bCs w:val="false"/>
+                <w:color w:val="1D1D1B"/>
+                <w:sz w:val="20"/>
+                <w:szCs w:val="20"/>
+              </w:rPr>
+              <w:t xml:space="preserve">$61,875</w:t>
             </w:r>
           </w:p>
         </w:tc>
@@ -2183,7 +2109,7 @@
       <w:tr>
         <w:tc>
           <w:tcPr>
-            <w:tcW w:type="dxa" w:w="2340"/>
+            <w:tcW w:type="dxa" w:w="2100"/>
             <w:tcMar>
               <w:top w:type="dxa" w:w="80"/>
               <w:left w:type="dxa" w:w="120"/>
@@ -2207,6 +2133,30 @@
         </w:tc>
         <w:tc>
           <w:tcPr>
+            <w:tcW w:type="dxa" w:w="1350"/>
+            <w:tcMar>
+              <w:top w:type="dxa" w:w="80"/>
+              <w:left w:type="dxa" w:w="120"/>
+              <w:bottom w:type="dxa" w:w="80"/>
+              <w:right w:type="dxa" w:w="120"/>
+            </w:tcMar>
+          </w:tcPr>
+          <w:p>
+            <w:r>
+              <w:rPr>
+                <w:rFonts w:ascii="Open Sans" w:cs="Open Sans" w:eastAsia="Open Sans" w:hAnsi="Open Sans"/>
+                <w:b w:val="false"/>
+                <w:bCs w:val="false"/>
+                <w:color w:val="1D1D1B"/>
+                <w:sz w:val="20"/>
+                <w:szCs w:val="20"/>
+              </w:rPr>
+              <w:t xml:space="preserve">$250,000</w:t>
+            </w:r>
+          </w:p>
+        </w:tc>
+        <w:tc>
+          <w:tcPr>
             <w:tcW w:type="dxa" w:w="1500"/>
             <w:tcMar>
               <w:top w:type="dxa" w:w="80"/>
@@ -2225,30 +2175,6 @@
                 <w:sz w:val="20"/>
                 <w:szCs w:val="20"/>
               </w:rPr>
-              <w:t xml:space="preserve">$250,000</w:t>
-            </w:r>
-          </w:p>
-        </w:tc>
-        <w:tc>
-          <w:tcPr>
-            <w:tcW w:type="dxa" w:w="1800"/>
-            <w:tcMar>
-              <w:top w:type="dxa" w:w="80"/>
-              <w:left w:type="dxa" w:w="120"/>
-              <w:bottom w:type="dxa" w:w="80"/>
-              <w:right w:type="dxa" w:w="120"/>
-            </w:tcMar>
-          </w:tcPr>
-          <w:p>
-            <w:r>
-              <w:rPr>
-                <w:rFonts w:ascii="Open Sans" w:cs="Open Sans" w:eastAsia="Open Sans" w:hAnsi="Open Sans"/>
-                <w:b w:val="false"/>
-                <w:bCs w:val="false"/>
-                <w:color w:val="1D1D1B"/>
-                <w:sz w:val="20"/>
-                <w:szCs w:val="20"/>
-              </w:rPr>
               <w:t xml:space="preserve">$112,500</w:t>
             </w:r>
           </w:p>
@@ -2273,55 +2199,79 @@
                 <w:sz w:val="20"/>
                 <w:szCs w:val="20"/>
               </w:rPr>
-              <w:t xml:space="preserve">30%</w:t>
-            </w:r>
-          </w:p>
-        </w:tc>
-        <w:tc>
-          <w:tcPr>
-            <w:tcW w:type="dxa" w:w="1500"/>
-            <w:tcMar>
-              <w:top w:type="dxa" w:w="80"/>
-              <w:left w:type="dxa" w:w="120"/>
-              <w:bottom w:type="dxa" w:w="80"/>
-              <w:right w:type="dxa" w:w="120"/>
-            </w:tcMar>
-          </w:tcPr>
-          <w:p>
-            <w:r>
-              <w:rPr>
-                <w:rFonts w:ascii="Open Sans" w:cs="Open Sans" w:eastAsia="Open Sans" w:hAnsi="Open Sans"/>
-                <w:b w:val="false"/>
-                <w:bCs w:val="false"/>
-                <w:color w:val="1D1D1B"/>
-                <w:sz w:val="20"/>
-                <w:szCs w:val="20"/>
-              </w:rPr>
-              <w:t xml:space="preserve">$33,750</w:t>
-            </w:r>
-          </w:p>
-        </w:tc>
-        <w:tc>
-          <w:tcPr>
-            <w:tcW w:type="dxa" w:w="1420"/>
-            <w:tcMar>
-              <w:top w:type="dxa" w:w="80"/>
-              <w:left w:type="dxa" w:w="120"/>
-              <w:bottom w:type="dxa" w:w="80"/>
-              <w:right w:type="dxa" w:w="120"/>
-            </w:tcMar>
-          </w:tcPr>
-          <w:p>
-            <w:r>
-              <w:rPr>
-                <w:rFonts w:ascii="Open Sans" w:cs="Open Sans" w:eastAsia="Open Sans" w:hAnsi="Open Sans"/>
-                <w:b w:val="false"/>
-                <w:bCs w:val="false"/>
-                <w:color w:val="1D1D1B"/>
-                <w:sz w:val="20"/>
-                <w:szCs w:val="20"/>
-              </w:rPr>
-              <w:t xml:space="preserve">$92,813</w:t>
+              <w:t xml:space="preserve">35% (cap)</w:t>
+            </w:r>
+          </w:p>
+        </w:tc>
+        <w:tc>
+          <w:tcPr>
+            <w:tcW w:type="dxa" w:w="1300"/>
+            <w:tcMar>
+              <w:top w:type="dxa" w:w="80"/>
+              <w:left w:type="dxa" w:w="120"/>
+              <w:bottom w:type="dxa" w:w="80"/>
+              <w:right w:type="dxa" w:w="120"/>
+            </w:tcMar>
+          </w:tcPr>
+          <w:p>
+            <w:r>
+              <w:rPr>
+                <w:rFonts w:ascii="Open Sans" w:cs="Open Sans" w:eastAsia="Open Sans" w:hAnsi="Open Sans"/>
+                <w:b w:val="false"/>
+                <w:bCs w:val="false"/>
+                <w:color w:val="1D1D1B"/>
+                <w:sz w:val="20"/>
+                <w:szCs w:val="20"/>
+              </w:rPr>
+              <w:t xml:space="preserve">$39,375</w:t>
+            </w:r>
+          </w:p>
+        </w:tc>
+        <w:tc>
+          <w:tcPr>
+            <w:tcW w:type="dxa" w:w="1200"/>
+            <w:tcMar>
+              <w:top w:type="dxa" w:w="80"/>
+              <w:left w:type="dxa" w:w="120"/>
+              <w:bottom w:type="dxa" w:w="80"/>
+              <w:right w:type="dxa" w:w="120"/>
+            </w:tcMar>
+          </w:tcPr>
+          <w:p>
+            <w:r>
+              <w:rPr>
+                <w:rFonts w:ascii="Open Sans" w:cs="Open Sans" w:eastAsia="Open Sans" w:hAnsi="Open Sans"/>
+                <w:b w:val="false"/>
+                <w:bCs w:val="false"/>
+                <w:color w:val="1D1D1B"/>
+                <w:sz w:val="20"/>
+                <w:szCs w:val="20"/>
+              </w:rPr>
+              <w:t xml:space="preserve">15.75%</w:t>
+            </w:r>
+          </w:p>
+        </w:tc>
+        <w:tc>
+          <w:tcPr>
+            <w:tcW w:type="dxa" w:w="1110"/>
+            <w:tcMar>
+              <w:top w:type="dxa" w:w="80"/>
+              <w:left w:type="dxa" w:w="120"/>
+              <w:bottom w:type="dxa" w:w="80"/>
+              <w:right w:type="dxa" w:w="120"/>
+            </w:tcMar>
+          </w:tcPr>
+          <w:p>
+            <w:r>
+              <w:rPr>
+                <w:rFonts w:ascii="Open Sans" w:cs="Open Sans" w:eastAsia="Open Sans" w:hAnsi="Open Sans"/>
+                <w:b w:val="false"/>
+                <w:bCs w:val="false"/>
+                <w:color w:val="1D1D1B"/>
+                <w:sz w:val="20"/>
+                <w:szCs w:val="20"/>
+              </w:rPr>
+              <w:t xml:space="preserve">$101,250</w:t>
             </w:r>
           </w:p>
         </w:tc>
@@ -2329,153 +2279,7 @@
       <w:tr>
         <w:tc>
           <w:tcPr>
-            <w:tcW w:type="dxa" w:w="2340"/>
-            <w:tcMar>
-              <w:top w:type="dxa" w:w="80"/>
-              <w:left w:type="dxa" w:w="120"/>
-              <w:bottom w:type="dxa" w:w="80"/>
-              <w:right w:type="dxa" w:w="120"/>
-            </w:tcMar>
-          </w:tcPr>
-          <w:p>
-            <w:r>
-              <w:rPr>
-                <w:rFonts w:ascii="Open Sans" w:cs="Open Sans" w:eastAsia="Open Sans" w:hAnsi="Open Sans"/>
-                <w:b w:val="false"/>
-                <w:bCs w:val="false"/>
-                <w:color w:val="1D1D1B"/>
-                <w:sz w:val="20"/>
-                <w:szCs w:val="20"/>
-              </w:rPr>
-              <w:t xml:space="preserve">$750,000 – $1,000,000</w:t>
-            </w:r>
-          </w:p>
-        </w:tc>
-        <w:tc>
-          <w:tcPr>
-            <w:tcW w:type="dxa" w:w="1500"/>
-            <w:tcMar>
-              <w:top w:type="dxa" w:w="80"/>
-              <w:left w:type="dxa" w:w="120"/>
-              <w:bottom w:type="dxa" w:w="80"/>
-              <w:right w:type="dxa" w:w="120"/>
-            </w:tcMar>
-          </w:tcPr>
-          <w:p>
-            <w:r>
-              <w:rPr>
-                <w:rFonts w:ascii="Open Sans" w:cs="Open Sans" w:eastAsia="Open Sans" w:hAnsi="Open Sans"/>
-                <w:b w:val="false"/>
-                <w:bCs w:val="false"/>
-                <w:color w:val="1D1D1B"/>
-                <w:sz w:val="20"/>
-                <w:szCs w:val="20"/>
-              </w:rPr>
-              <w:t xml:space="preserve">$250,000</w:t>
-            </w:r>
-          </w:p>
-        </w:tc>
-        <w:tc>
-          <w:tcPr>
-            <w:tcW w:type="dxa" w:w="1800"/>
-            <w:tcMar>
-              <w:top w:type="dxa" w:w="80"/>
-              <w:left w:type="dxa" w:w="120"/>
-              <w:bottom w:type="dxa" w:w="80"/>
-              <w:right w:type="dxa" w:w="120"/>
-            </w:tcMar>
-          </w:tcPr>
-          <w:p>
-            <w:r>
-              <w:rPr>
-                <w:rFonts w:ascii="Open Sans" w:cs="Open Sans" w:eastAsia="Open Sans" w:hAnsi="Open Sans"/>
-                <w:b w:val="false"/>
-                <w:bCs w:val="false"/>
-                <w:color w:val="1D1D1B"/>
-                <w:sz w:val="20"/>
-                <w:szCs w:val="20"/>
-              </w:rPr>
-              <w:t xml:space="preserve">$112,500</w:t>
-            </w:r>
-          </w:p>
-        </w:tc>
-        <w:tc>
-          <w:tcPr>
-            <w:tcW w:type="dxa" w:w="800"/>
-            <w:tcMar>
-              <w:top w:type="dxa" w:w="80"/>
-              <w:left w:type="dxa" w:w="120"/>
-              <w:bottom w:type="dxa" w:w="80"/>
-              <w:right w:type="dxa" w:w="120"/>
-            </w:tcMar>
-          </w:tcPr>
-          <w:p>
-            <w:r>
-              <w:rPr>
-                <w:rFonts w:ascii="Open Sans" w:cs="Open Sans" w:eastAsia="Open Sans" w:hAnsi="Open Sans"/>
-                <w:b w:val="false"/>
-                <w:bCs w:val="false"/>
-                <w:color w:val="1D1D1B"/>
-                <w:sz w:val="20"/>
-                <w:szCs w:val="20"/>
-              </w:rPr>
-              <w:t xml:space="preserve">32.5%</w:t>
-            </w:r>
-          </w:p>
-        </w:tc>
-        <w:tc>
-          <w:tcPr>
-            <w:tcW w:type="dxa" w:w="1500"/>
-            <w:tcMar>
-              <w:top w:type="dxa" w:w="80"/>
-              <w:left w:type="dxa" w:w="120"/>
-              <w:bottom w:type="dxa" w:w="80"/>
-              <w:right w:type="dxa" w:w="120"/>
-            </w:tcMar>
-          </w:tcPr>
-          <w:p>
-            <w:r>
-              <w:rPr>
-                <w:rFonts w:ascii="Open Sans" w:cs="Open Sans" w:eastAsia="Open Sans" w:hAnsi="Open Sans"/>
-                <w:b w:val="false"/>
-                <w:bCs w:val="false"/>
-                <w:color w:val="1D1D1B"/>
-                <w:sz w:val="20"/>
-                <w:szCs w:val="20"/>
-              </w:rPr>
-              <w:t xml:space="preserve">$36,563</w:t>
-            </w:r>
-          </w:p>
-        </w:tc>
-        <w:tc>
-          <w:tcPr>
-            <w:tcW w:type="dxa" w:w="1420"/>
-            <w:tcMar>
-              <w:top w:type="dxa" w:w="80"/>
-              <w:left w:type="dxa" w:w="120"/>
-              <w:bottom w:type="dxa" w:w="80"/>
-              <w:right w:type="dxa" w:w="120"/>
-            </w:tcMar>
-          </w:tcPr>
-          <w:p>
-            <w:r>
-              <w:rPr>
-                <w:rFonts w:ascii="Open Sans" w:cs="Open Sans" w:eastAsia="Open Sans" w:hAnsi="Open Sans"/>
-                <w:b w:val="false"/>
-                <w:bCs w:val="false"/>
-                <w:color w:val="1D1D1B"/>
-                <w:sz w:val="20"/>
-                <w:szCs w:val="20"/>
-              </w:rPr>
-              <w:t xml:space="preserve">$129,375</w:t>
-            </w:r>
-          </w:p>
-        </w:tc>
-      </w:tr>
-      <w:tr>
-        <w:tc>
-          <w:tcPr>
-            <w:tcW w:type="dxa" w:w="2340"/>
+            <w:tcW w:type="dxa" w:w="2100"/>
             <w:shd w:fill="FFE4EA" w:val="clear"/>
             <w:tcMar>
               <w:top w:type="dxa" w:w="80"/>
@@ -2494,7 +2298,32 @@
                 <w:sz w:val="20"/>
                 <w:szCs w:val="20"/>
               </w:rPr>
-              <w:t xml:space="preserve">$1,000,000 – $1,250,000</w:t>
+              <w:t xml:space="preserve">$750,000 – $1,000,000</w:t>
+            </w:r>
+          </w:p>
+        </w:tc>
+        <w:tc>
+          <w:tcPr>
+            <w:tcW w:type="dxa" w:w="1350"/>
+            <w:shd w:fill="FFE4EA" w:val="clear"/>
+            <w:tcMar>
+              <w:top w:type="dxa" w:w="80"/>
+              <w:left w:type="dxa" w:w="120"/>
+              <w:bottom w:type="dxa" w:w="80"/>
+              <w:right w:type="dxa" w:w="120"/>
+            </w:tcMar>
+          </w:tcPr>
+          <w:p>
+            <w:r>
+              <w:rPr>
+                <w:rFonts w:ascii="Open Sans" w:cs="Open Sans" w:eastAsia="Open Sans" w:hAnsi="Open Sans"/>
+                <w:b/>
+                <w:bCs/>
+                <w:color w:val="1D1D1B"/>
+                <w:sz w:val="20"/>
+                <w:szCs w:val="20"/>
+              </w:rPr>
+              <w:t xml:space="preserve">$250,000</w:t>
             </w:r>
           </w:p>
         </w:tc>
@@ -2519,13 +2348,13 @@
                 <w:sz w:val="20"/>
                 <w:szCs w:val="20"/>
               </w:rPr>
-              <w:t xml:space="preserve">$250,000</w:t>
-            </w:r>
-          </w:p>
-        </w:tc>
-        <w:tc>
-          <w:tcPr>
-            <w:tcW w:type="dxa" w:w="1800"/>
+              <w:t xml:space="preserve">$112,500</w:t>
+            </w:r>
+          </w:p>
+        </w:tc>
+        <w:tc>
+          <w:tcPr>
+            <w:tcW w:type="dxa" w:w="800"/>
             <w:shd w:fill="FFE4EA" w:val="clear"/>
             <w:tcMar>
               <w:top w:type="dxa" w:w="80"/>
@@ -2544,13 +2373,13 @@
                 <w:sz w:val="20"/>
                 <w:szCs w:val="20"/>
               </w:rPr>
-              <w:t xml:space="preserve">$112,500</w:t>
-            </w:r>
-          </w:p>
-        </w:tc>
-        <w:tc>
-          <w:tcPr>
-            <w:tcW w:type="dxa" w:w="800"/>
+              <w:t xml:space="preserve">35% (cap)</w:t>
+            </w:r>
+          </w:p>
+        </w:tc>
+        <w:tc>
+          <w:tcPr>
+            <w:tcW w:type="dxa" w:w="1300"/>
             <w:shd w:fill="FFE4EA" w:val="clear"/>
             <w:tcMar>
               <w:top w:type="dxa" w:w="80"/>
@@ -2569,13 +2398,13 @@
                 <w:sz w:val="20"/>
                 <w:szCs w:val="20"/>
               </w:rPr>
-              <w:t xml:space="preserve">35% (cap)</w:t>
-            </w:r>
-          </w:p>
-        </w:tc>
-        <w:tc>
-          <w:tcPr>
-            <w:tcW w:type="dxa" w:w="1500"/>
+              <w:t xml:space="preserve">$39,375</w:t>
+            </w:r>
+          </w:p>
+        </w:tc>
+        <w:tc>
+          <w:tcPr>
+            <w:tcW w:type="dxa" w:w="1200"/>
             <w:shd w:fill="FFE4EA" w:val="clear"/>
             <w:tcMar>
               <w:top w:type="dxa" w:w="80"/>
@@ -2594,13 +2423,13 @@
                 <w:sz w:val="20"/>
                 <w:szCs w:val="20"/>
               </w:rPr>
-              <w:t xml:space="preserve">$39,375</w:t>
-            </w:r>
-          </w:p>
-        </w:tc>
-        <w:tc>
-          <w:tcPr>
-            <w:tcW w:type="dxa" w:w="1420"/>
+              <w:t xml:space="preserve">15.75%</w:t>
+            </w:r>
+          </w:p>
+        </w:tc>
+        <w:tc>
+          <w:tcPr>
+            <w:tcW w:type="dxa" w:w="1110"/>
             <w:shd w:fill="FFE4EA" w:val="clear"/>
             <w:tcMar>
               <w:top w:type="dxa" w:w="80"/>
@@ -2619,7 +2448,7 @@
                 <w:sz w:val="20"/>
                 <w:szCs w:val="20"/>
               </w:rPr>
-              <w:t xml:space="preserve">$168,750</w:t>
+              <w:t xml:space="preserve">$140,625</w:t>
             </w:r>
           </w:p>
         </w:tc>

</xml_diff>